<commit_message>
Resolve redirect-or-410 disposition for all 222 unassigned removed URLs
Cross-checks each removed URL (180 live articles + 42 legacy aliases
whose old target is also being cut) against the 223 retained article
URLs and the live socialpilot.co domain (features/industry/tools/
compare pages, verified via search) to find a genuinely relevant
redirect target. Result: 131 redirects (61 high-confidence, 70 medium/
low needing a quick SEO spot-check) and 91 confirmed 410s with no
equivalent content anywhere on the domain.

Full URL-by-URL detail is in the new appendix workbook; the main plan's
Section 4 now reports the resolved breakdown instead of flagging it as
an open gap.

Co-Authored-By: Claude Sonnet 5 <noreply@anthropic.com>
Claude-Session: https://claude.ai/code/session_01SGm9DPHLKvwYAnYaGmUjyG
</commit_message>
<xml_diff>
--- a/BLOG_MIGRATION_PLAN__SocialPilot_v1.docx
+++ b/BLOG_MIGRATION_PLAN__SocialPilot_v1.docx
@@ -190,6 +190,30 @@
           <w:color w:val="141413"/>
           <w:sz w:val="19"/>
         </w:rPr>
+        <w:t xml:space="preserve">Redirect research done: </w:t>
+      </w:r>
+      <w:r>
+        <w:rPr>
+          <w:b w:val="0"/>
+          <w:i w:val="0"/>
+          <w:color w:val="141413"/>
+          <w:sz w:val="19"/>
+        </w:rPr>
+        <w:t>All 222 removed URLs that lacked a defined disposition now have one: 131 get a redirect to a genuinely relevant, verified-live page elsewhere on socialpilot.co; 91 are confirmed 410s with no suitable equivalent. See Section 4 and the appendix workbook.</w:t>
+      </w:r>
+    </w:p>
+    <w:p>
+      <w:pPr>
+        <w:pStyle w:val="ListBullet"/>
+        <w:spacing w:before="20" w:after="20"/>
+      </w:pPr>
+      <w:r>
+        <w:rPr>
+          <w:b/>
+          <w:i w:val="0"/>
+          <w:color w:val="141413"/>
+          <w:sz w:val="19"/>
+        </w:rPr>
         <w:t xml:space="preserve">Open item: </w:t>
       </w:r>
       <w:r>
@@ -199,7 +223,7 @@
           <w:color w:val="141413"/>
           <w:sz w:val="19"/>
         </w:rPr>
-        <w:t>180 live articles being removed have no redirect target or 410 specified in the source sheet, and 1,778 internal links currently point at pages being removed. Both need a decision before launch — see Section 4.</w:t>
+        <w:t>1,778 internal links currently point at pages being removed and need repointing regardless of the redirect/410 call — see Section 5.</w:t>
       </w:r>
     </w:p>
     <w:tbl>
@@ -1396,7 +1420,7 @@
                 <w:color w:val="141413"/>
                 <w:sz w:val="16"/>
               </w:rPr>
-              <w:t>See Section 4 — disposition not yet decided</w:t>
+              <w:t>Resolved — redirect or 410 assigned, see Section 4</w:t>
             </w:r>
           </w:p>
         </w:tc>
@@ -1442,7 +1466,7 @@
                 <w:color w:val="FFFFFF"/>
                 <w:sz w:val="22"/>
               </w:rPr>
-              <w:t>4. OPEN DECISIONS — RESOLVE BEFORE LAUNCH</w:t>
+              <w:t>4. WHERE DO REMOVED ARTICLES GO? (RESEARCH COMPLETE)</w:t>
             </w:r>
           </w:p>
         </w:tc>
@@ -1453,6 +1477,476 @@
         <w:spacing w:before="40" w:after="40"/>
         <w:jc w:val="left"/>
       </w:pPr>
+    </w:p>
+    <w:p>
+      <w:pPr>
+        <w:spacing w:before="80" w:after="120"/>
+        <w:jc w:val="left"/>
+      </w:pPr>
+      <w:r>
+        <w:rPr>
+          <w:b w:val="0"/>
+          <w:color w:val="141413"/>
+          <w:sz w:val="19"/>
+        </w:rPr>
+        <w:t>The source sheet only specified a 410 for 6 URLs, leaving 222 removed URLs (the 180 live articles above, plus 42 legacy aliases whose old redirect target is also being cut) with no defined disposition. Each of the 222 was checked against the 223 retained articles’ new URLs AND the live socialpilot.co domain — /features, /industry, /tools, /compare — for a genuinely relevant, real, verified-live destination before deciding.</w:t>
+      </w:r>
+    </w:p>
+    <w:tbl>
+      <w:tblPr>
+        <w:tblStyle w:val="TableGrid"/>
+        <w:tblW w:type="auto" w:w="0"/>
+        <w:tblLook w:firstColumn="1" w:firstRow="1" w:lastColumn="0" w:lastRow="0" w:noHBand="0" w:noVBand="1" w:val="04A0"/>
+      </w:tblPr>
+      <w:tblGrid>
+        <w:gridCol w:w="2484"/>
+        <w:gridCol w:w="2484"/>
+        <w:gridCol w:w="2484"/>
+        <w:gridCol w:w="2484"/>
+      </w:tblGrid>
+      <w:tr>
+        <w:tc>
+          <w:tcPr>
+            <w:tcW w:type="dxa" w:w="2880"/>
+            <w:shd w:val="clear" w:color="auto" w:fill="1A56DB"/>
+          </w:tcPr>
+          <w:p>
+            <w:pPr>
+              <w:spacing w:before="40" w:after="40"/>
+              <w:jc w:val="left"/>
+            </w:pPr>
+            <w:r>
+              <w:rPr>
+                <w:b/>
+                <w:i w:val="0"/>
+                <w:color w:val="FFFFFF"/>
+                <w:sz w:val="18"/>
+              </w:rPr>
+              <w:t>Outcome</w:t>
+            </w:r>
+          </w:p>
+        </w:tc>
+        <w:tc>
+          <w:tcPr>
+            <w:tcW w:type="dxa" w:w="1008"/>
+            <w:shd w:val="clear" w:color="auto" w:fill="1A56DB"/>
+          </w:tcPr>
+          <w:p>
+            <w:pPr>
+              <w:spacing w:before="40" w:after="40"/>
+              <w:jc w:val="left"/>
+            </w:pPr>
+            <w:r>
+              <w:rPr>
+                <w:b/>
+                <w:i w:val="0"/>
+                <w:color w:val="FFFFFF"/>
+                <w:sz w:val="18"/>
+              </w:rPr>
+              <w:t>Count</w:t>
+            </w:r>
+          </w:p>
+        </w:tc>
+        <w:tc>
+          <w:tcPr>
+            <w:tcW w:type="dxa" w:w="1656"/>
+            <w:shd w:val="clear" w:color="auto" w:fill="1A56DB"/>
+          </w:tcPr>
+          <w:p>
+            <w:pPr>
+              <w:spacing w:before="40" w:after="40"/>
+              <w:jc w:val="left"/>
+            </w:pPr>
+            <w:r>
+              <w:rPr>
+                <w:b/>
+                <w:i w:val="0"/>
+                <w:color w:val="FFFFFF"/>
+                <w:sz w:val="18"/>
+              </w:rPr>
+              <w:t>Sessions (12mo)</w:t>
+            </w:r>
+          </w:p>
+        </w:tc>
+        <w:tc>
+          <w:tcPr>
+            <w:tcW w:type="dxa" w:w="2981"/>
+            <w:shd w:val="clear" w:color="auto" w:fill="1A56DB"/>
+          </w:tcPr>
+          <w:p>
+            <w:pPr>
+              <w:spacing w:before="40" w:after="40"/>
+              <w:jc w:val="left"/>
+            </w:pPr>
+            <w:r>
+              <w:rPr>
+                <w:b/>
+                <w:i w:val="0"/>
+                <w:color w:val="FFFFFF"/>
+                <w:sz w:val="18"/>
+              </w:rPr>
+              <w:t>What it means</w:t>
+            </w:r>
+          </w:p>
+        </w:tc>
+      </w:tr>
+      <w:tr>
+        <w:tc>
+          <w:tcPr>
+            <w:tcW w:type="dxa" w:w="2880"/>
+            <w:shd w:val="clear" w:color="auto" w:fill="FFFFFF"/>
+          </w:tcPr>
+          <w:p>
+            <w:pPr>
+              <w:spacing w:before="40" w:after="40"/>
+              <w:jc w:val="left"/>
+            </w:pPr>
+            <w:r>
+              <w:rPr>
+                <w:b w:val="0"/>
+                <w:i w:val="0"/>
+                <w:color w:val="141413"/>
+                <w:sz w:val="16"/>
+              </w:rPr>
+              <w:t>Redirect — high confidence</w:t>
+            </w:r>
+          </w:p>
+        </w:tc>
+        <w:tc>
+          <w:tcPr>
+            <w:tcW w:type="dxa" w:w="1008"/>
+            <w:shd w:val="clear" w:color="auto" w:fill="FFFFFF"/>
+          </w:tcPr>
+          <w:p>
+            <w:pPr>
+              <w:spacing w:before="40" w:after="40"/>
+              <w:jc w:val="left"/>
+            </w:pPr>
+            <w:r>
+              <w:rPr>
+                <w:b w:val="0"/>
+                <w:i w:val="0"/>
+                <w:color w:val="141413"/>
+                <w:sz w:val="16"/>
+              </w:rPr>
+              <w:t>61</w:t>
+            </w:r>
+          </w:p>
+        </w:tc>
+        <w:tc>
+          <w:tcPr>
+            <w:tcW w:type="dxa" w:w="1656"/>
+            <w:shd w:val="clear" w:color="auto" w:fill="FFFFFF"/>
+          </w:tcPr>
+          <w:p>
+            <w:pPr>
+              <w:spacing w:before="40" w:after="40"/>
+              <w:jc w:val="left"/>
+            </w:pPr>
+            <w:r>
+              <w:rPr>
+                <w:b w:val="0"/>
+                <w:i w:val="0"/>
+                <w:color w:val="141413"/>
+                <w:sz w:val="16"/>
+              </w:rPr>
+              <w:t>—</w:t>
+            </w:r>
+          </w:p>
+        </w:tc>
+        <w:tc>
+          <w:tcPr>
+            <w:tcW w:type="dxa" w:w="2981"/>
+            <w:shd w:val="clear" w:color="auto" w:fill="FFFFFF"/>
+          </w:tcPr>
+          <w:p>
+            <w:pPr>
+              <w:spacing w:before="40" w:after="40"/>
+              <w:jc w:val="left"/>
+            </w:pPr>
+            <w:r>
+              <w:rPr>
+                <w:b w:val="0"/>
+                <w:i w:val="0"/>
+                <w:color w:val="141413"/>
+                <w:sz w:val="16"/>
+              </w:rPr>
+              <w:t>Clear topical match to a retained page (e.g. how-to-sell-on-pinterest → how-to-make-money-on-pinterest)</w:t>
+            </w:r>
+          </w:p>
+        </w:tc>
+      </w:tr>
+      <w:tr>
+        <w:tc>
+          <w:tcPr>
+            <w:tcW w:type="dxa" w:w="2880"/>
+            <w:shd w:val="clear" w:color="auto" w:fill="FAFAFA"/>
+          </w:tcPr>
+          <w:p>
+            <w:pPr>
+              <w:spacing w:before="40" w:after="40"/>
+              <w:jc w:val="left"/>
+            </w:pPr>
+            <w:r>
+              <w:rPr>
+                <w:b w:val="0"/>
+                <w:i w:val="0"/>
+                <w:color w:val="141413"/>
+                <w:sz w:val="16"/>
+              </w:rPr>
+              <w:t>Redirect — medium/low confidence</w:t>
+            </w:r>
+          </w:p>
+        </w:tc>
+        <w:tc>
+          <w:tcPr>
+            <w:tcW w:type="dxa" w:w="1008"/>
+            <w:shd w:val="clear" w:color="auto" w:fill="FAFAFA"/>
+          </w:tcPr>
+          <w:p>
+            <w:pPr>
+              <w:spacing w:before="40" w:after="40"/>
+              <w:jc w:val="left"/>
+            </w:pPr>
+            <w:r>
+              <w:rPr>
+                <w:b w:val="0"/>
+                <w:i w:val="0"/>
+                <w:color w:val="141413"/>
+                <w:sz w:val="16"/>
+              </w:rPr>
+              <w:t>70</w:t>
+            </w:r>
+          </w:p>
+        </w:tc>
+        <w:tc>
+          <w:tcPr>
+            <w:tcW w:type="dxa" w:w="1656"/>
+            <w:shd w:val="clear" w:color="auto" w:fill="FAFAFA"/>
+          </w:tcPr>
+          <w:p>
+            <w:pPr>
+              <w:spacing w:before="40" w:after="40"/>
+              <w:jc w:val="left"/>
+            </w:pPr>
+            <w:r>
+              <w:rPr>
+                <w:b w:val="0"/>
+                <w:i w:val="0"/>
+                <w:color w:val="141413"/>
+                <w:sz w:val="16"/>
+              </w:rPr>
+              <w:t>—</w:t>
+            </w:r>
+          </w:p>
+        </w:tc>
+        <w:tc>
+          <w:tcPr>
+            <w:tcW w:type="dxa" w:w="2981"/>
+            <w:shd w:val="clear" w:color="auto" w:fill="FAFAFA"/>
+          </w:tcPr>
+          <w:p>
+            <w:pPr>
+              <w:spacing w:before="40" w:after="40"/>
+              <w:jc w:val="left"/>
+            </w:pPr>
+            <w:r>
+              <w:rPr>
+                <w:b w:val="0"/>
+                <w:i w:val="0"/>
+                <w:color w:val="141413"/>
+                <w:sz w:val="16"/>
+              </w:rPr>
+              <w:t>Reasonable but broader match (e.g. a niche how-to folding into a general topic hub)</w:t>
+            </w:r>
+          </w:p>
+        </w:tc>
+      </w:tr>
+      <w:tr>
+        <w:tc>
+          <w:tcPr>
+            <w:tcW w:type="dxa" w:w="2880"/>
+            <w:shd w:val="clear" w:color="auto" w:fill="FFFFFF"/>
+          </w:tcPr>
+          <w:p>
+            <w:pPr>
+              <w:spacing w:before="40" w:after="40"/>
+              <w:jc w:val="left"/>
+            </w:pPr>
+            <w:r>
+              <w:rPr>
+                <w:b w:val="0"/>
+                <w:i w:val="0"/>
+                <w:color w:val="141413"/>
+                <w:sz w:val="16"/>
+              </w:rPr>
+              <w:t>410 Gone</w:t>
+            </w:r>
+          </w:p>
+        </w:tc>
+        <w:tc>
+          <w:tcPr>
+            <w:tcW w:type="dxa" w:w="1008"/>
+            <w:shd w:val="clear" w:color="auto" w:fill="FFFFFF"/>
+          </w:tcPr>
+          <w:p>
+            <w:pPr>
+              <w:spacing w:before="40" w:after="40"/>
+              <w:jc w:val="left"/>
+            </w:pPr>
+            <w:r>
+              <w:rPr>
+                <w:b w:val="0"/>
+                <w:i w:val="0"/>
+                <w:color w:val="141413"/>
+                <w:sz w:val="16"/>
+              </w:rPr>
+              <w:t>91</w:t>
+            </w:r>
+          </w:p>
+        </w:tc>
+        <w:tc>
+          <w:tcPr>
+            <w:tcW w:type="dxa" w:w="1656"/>
+            <w:shd w:val="clear" w:color="auto" w:fill="FFFFFF"/>
+          </w:tcPr>
+          <w:p>
+            <w:pPr>
+              <w:spacing w:before="40" w:after="40"/>
+              <w:jc w:val="left"/>
+            </w:pPr>
+            <w:r>
+              <w:rPr>
+                <w:b w:val="0"/>
+                <w:i w:val="0"/>
+                <w:color w:val="141413"/>
+                <w:sz w:val="16"/>
+              </w:rPr>
+              <w:t>2,697</w:t>
+            </w:r>
+          </w:p>
+        </w:tc>
+        <w:tc>
+          <w:tcPr>
+            <w:tcW w:type="dxa" w:w="2981"/>
+            <w:shd w:val="clear" w:color="auto" w:fill="FFFFFF"/>
+          </w:tcPr>
+          <w:p>
+            <w:pPr>
+              <w:spacing w:before="40" w:after="40"/>
+              <w:jc w:val="left"/>
+            </w:pPr>
+            <w:r>
+              <w:rPr>
+                <w:b w:val="0"/>
+                <w:i w:val="0"/>
+                <w:color w:val="141413"/>
+                <w:sz w:val="16"/>
+              </w:rPr>
+              <w:t>No equivalent content exists anywhere on the domain — safe to retire outright</w:t>
+            </w:r>
+          </w:p>
+        </w:tc>
+      </w:tr>
+      <w:tr>
+        <w:tc>
+          <w:tcPr>
+            <w:tcW w:type="dxa" w:w="2880"/>
+            <w:shd w:val="clear" w:color="auto" w:fill="FAFAFA"/>
+          </w:tcPr>
+          <w:p>
+            <w:pPr>
+              <w:spacing w:before="40" w:after="40"/>
+              <w:jc w:val="left"/>
+            </w:pPr>
+            <w:r>
+              <w:rPr>
+                <w:b w:val="0"/>
+                <w:i w:val="0"/>
+                <w:color w:val="141413"/>
+                <w:sz w:val="16"/>
+              </w:rPr>
+              <w:t>Total resolved</w:t>
+            </w:r>
+          </w:p>
+        </w:tc>
+        <w:tc>
+          <w:tcPr>
+            <w:tcW w:type="dxa" w:w="1008"/>
+            <w:shd w:val="clear" w:color="auto" w:fill="FAFAFA"/>
+          </w:tcPr>
+          <w:p>
+            <w:pPr>
+              <w:spacing w:before="40" w:after="40"/>
+              <w:jc w:val="left"/>
+            </w:pPr>
+            <w:r>
+              <w:rPr>
+                <w:b w:val="0"/>
+                <w:i w:val="0"/>
+                <w:color w:val="141413"/>
+                <w:sz w:val="16"/>
+              </w:rPr>
+              <w:t>222</w:t>
+            </w:r>
+          </w:p>
+        </w:tc>
+        <w:tc>
+          <w:tcPr>
+            <w:tcW w:type="dxa" w:w="1656"/>
+            <w:shd w:val="clear" w:color="auto" w:fill="FAFAFA"/>
+          </w:tcPr>
+          <w:p>
+            <w:pPr>
+              <w:spacing w:before="40" w:after="40"/>
+              <w:jc w:val="left"/>
+            </w:pPr>
+            <w:r>
+              <w:rPr>
+                <w:b w:val="0"/>
+                <w:i w:val="0"/>
+                <w:color w:val="141413"/>
+                <w:sz w:val="16"/>
+              </w:rPr>
+              <w:t>5,141 (redirects)</w:t>
+            </w:r>
+          </w:p>
+        </w:tc>
+        <w:tc>
+          <w:tcPr>
+            <w:tcW w:type="dxa" w:w="2981"/>
+            <w:shd w:val="clear" w:color="auto" w:fill="FAFAFA"/>
+          </w:tcPr>
+          <w:p>
+            <w:pPr>
+              <w:spacing w:before="40" w:after="40"/>
+              <w:jc w:val="left"/>
+            </w:pPr>
+            <w:r>
+              <w:rPr>
+                <w:b w:val="0"/>
+                <w:i w:val="0"/>
+                <w:color w:val="141413"/>
+                <w:sz w:val="16"/>
+              </w:rPr>
+            </w:r>
+          </w:p>
+        </w:tc>
+      </w:tr>
+    </w:tbl>
+    <w:p>
+      <w:pPr>
+        <w:spacing w:before="160" w:after="80"/>
+        <w:jc w:val="left"/>
+      </w:pPr>
+      <w:r>
+        <w:rPr>
+          <w:b/>
+          <w:color w:val="141413"/>
+          <w:sz w:val="19"/>
+        </w:rPr>
+        <w:t>Full URL-by-URL detail — old URL, action, redirect target, confidence, and rationale — is in the companion workbook: BLOG_MIGRATION_removed_url_redirect_map__appendix.xlsx</w:t>
+      </w:r>
     </w:p>
     <w:tbl>
       <w:tblPr>
@@ -1479,7 +1973,7 @@
                 <w:color w:val="B42318"/>
                 <w:sz w:val="20"/>
               </w:rPr>
-              <w:t>Flag 1 — 180 live articles have no defined disposition</w:t>
+              <w:t>Still needs sign-off before launch</w:t>
             </w:r>
           </w:p>
           <w:p>
@@ -1491,7 +1985,7 @@
                 <w:color w:val="141413"/>
                 <w:sz w:val="19"/>
               </w:rPr>
-              <w:t>•  The source sheet explicitly flags only 6 URLs for a 410. The remaining ~174 live, low-traffic articles being removed aren’t assigned a 410 or a redirect target.</w:t>
+              <w:t>•  The 70 "medium/low confidence" redirects are judgment calls (e.g. a dentists article folding into a general doctors/healthcare page) — SEO/content lead should spot-check these before they go live.</w:t>
             </w:r>
           </w:p>
           <w:p>
@@ -1503,7 +1997,7 @@
                 <w:color w:val="141413"/>
                 <w:sz w:val="19"/>
               </w:rPr>
-              <w:t>•  Recommendation: default these to a 410 (Gone). They’re thin and low-traffic; forcing a 301 to a loosely-related retained article would just dilute that page’s relevance signal.</w:t>
+              <w:t>•  8 of the 131 redirects point outside the original mapping tab — to /compare, /insights, or /industry/* pages found by auditing the live site. Confirm these hub pages are the intended landing spots, not just an acceptable fallback.</w:t>
             </w:r>
           </w:p>
           <w:p>
@@ -1515,68 +2009,7 @@
                 <w:color w:val="141413"/>
                 <w:sz w:val="19"/>
               </w:rPr>
-              <w:t>•  Needs a quick sign-off from SEO/content lead before the redirect map is finalized.</w:t>
-            </w:r>
-          </w:p>
-        </w:tc>
-      </w:tr>
-    </w:tbl>
-    <w:p>
-      <w:pPr>
-        <w:spacing w:before="40" w:after="40"/>
-        <w:jc w:val="left"/>
-      </w:pPr>
-    </w:p>
-    <w:tbl>
-      <w:tblPr>
-        <w:tblStyle w:val="TableGrid"/>
-        <w:tblW w:type="auto" w:w="0"/>
-        <w:tblLook w:firstColumn="1" w:firstRow="1" w:lastColumn="0" w:lastRow="0" w:noHBand="0" w:noVBand="1" w:val="04A0"/>
-      </w:tblPr>
-      <w:tblGrid>
-        <w:gridCol w:w="9936"/>
-      </w:tblGrid>
-      <w:tr>
-        <w:tc>
-          <w:tcPr>
-            <w:tcW w:type="dxa" w:w="9936"/>
-            <w:shd w:val="clear" w:color="auto" w:fill="FDECEC"/>
-          </w:tcPr>
-          <w:p>
-            <w:pPr>
-              <w:spacing w:before="80" w:after="40"/>
-            </w:pPr>
-            <w:r>
-              <w:rPr>
-                <w:b/>
-                <w:color w:val="B42318"/>
-                <w:sz w:val="20"/>
-              </w:rPr>
-              <w:t>Flag 2 — 1,778 internal links point at pages being removed</w:t>
-            </w:r>
-          </w:p>
-          <w:p>
-            <w:pPr>
-              <w:spacing w:before="20" w:after="60"/>
-            </w:pPr>
-            <w:r>
-              <w:rPr>
-                <w:color w:val="141413"/>
-                <w:sz w:val="19"/>
-              </w:rPr>
-              <w:t>•  These links live on OTHER pages across the site (not just the removed pages themselves) and need to be found and repointed — a 410 alone will not fix a live internal link pointing at a dead page.</w:t>
-            </w:r>
-          </w:p>
-          <w:p>
-            <w:pPr>
-              <w:spacing w:before="20" w:after="60"/>
-            </w:pPr>
-            <w:r>
-              <w:rPr>
-                <w:color w:val="141413"/>
-                <w:sz w:val="19"/>
-              </w:rPr>
-              <w:t>•  Action: run an internal-link audit against the 298 removed URLs and update/remove those links as part of the same release.</w:t>
+              <w:t>•  1,778 internal links across the site currently point at pages being removed. These need to be found and repointed to the new redirect targets (or removed, for pages going to a 410) — a redirect alone does not fix a stale internal link. See Section 5.</w:t>
             </w:r>
           </w:p>
         </w:tc>
@@ -1636,7 +2069,7 @@
           <w:color w:val="141413"/>
           <w:sz w:val="19"/>
         </w:rPr>
-        <w:t>Sign off on disposition (410 vs. redirect) for the 180 live removed articles.</w:t>
+        <w:t>SEO/content lead spot-checks the 70 medium/low-confidence redirects in the appendix workbook (Section 4).</w:t>
       </w:r>
     </w:p>
     <w:p>
@@ -1649,7 +2082,7 @@
           <w:color w:val="141413"/>
           <w:sz w:val="19"/>
         </w:rPr>
-        <w:t>Implement all 223 verified 301 redirects from the URL Mapping tab.</w:t>
+        <w:t>Implement all 223 verified 301 redirects from the URL Mapping tab (retained articles).</w:t>
       </w:r>
     </w:p>
     <w:p>
@@ -1662,7 +2095,7 @@
           <w:color w:val="141413"/>
           <w:sz w:val="19"/>
         </w:rPr>
-        <w:t>Implement 410s for confirmed dead articles and pruned tag pages.</w:t>
+        <w:t>Implement the 131 redirects + 91 410s for removed URLs from the appendix workbook.</w:t>
       </w:r>
     </w:p>
     <w:p>
@@ -1727,7 +2160,7 @@
           <w:color w:val="141413"/>
           <w:sz w:val="19"/>
         </w:rPr>
-        <w:t>Monitor 404s, redirect chains, and organic traffic for the 223 migrated URLs at 7 / 30 / 60 / 90 days post-launch.</w:t>
+        <w:t>Monitor 404s, redirect chains, and organic traffic for all migrated/redirected URLs at 7 / 30 / 60 / 90 days post-launch.</w:t>
       </w:r>
     </w:p>
     <w:tbl>
@@ -1861,7 +2294,7 @@
                 <w:color w:val="141413"/>
                 <w:sz w:val="17"/>
               </w:rPr>
-              <w:t>Resolve open decisions (Section 4); QA final redirect map with SEO</w:t>
+              <w:t>SEO sign-off on the removed-URL redirect map (Section 4); QA full redirect set</w:t>
             </w:r>
           </w:p>
         </w:tc>
@@ -2073,7 +2506,7 @@
           <w:color w:val="141413"/>
           <w:sz w:val="19"/>
         </w:rPr>
-        <w:t>All 223 redirects resolve in a single hop — no chains.</w:t>
+        <w:t>All 223 retained-article redirects resolve in a single hop — no chains.</w:t>
       </w:r>
     </w:p>
     <w:p>

</xml_diff>

<commit_message>
Fix traffic-exposure numbers and clarify /industry redirect targets
Combined removed-URL session count was undercounting: 7,244 only covered
the 180 live pages, not the 118 already-redirected aliases that also
carry sessions. Corrected to 8,675 (~3% of retained traffic) and updated
internal-link count to the full 298-URL scope (1,814, not 1,778).

Added a note to Section 1 and refined the Section 4 flag: only 3 of the
131 proposed redirects go to /industry/* pages, which are pre-existing
and unrelated to this restructure (not a fifth destination bucket); the
other 5 "outside the mapping tab" redirects land on the /compare and
/insights hub pages already part of the new IA.

Co-Authored-By: Claude Sonnet 5 <noreply@anthropic.com>
Claude-Session: https://claude.ai/code/session_01SGm9DPHLKvwYAnYaGmUjyG
</commit_message>
<xml_diff>
--- a/BLOG_MIGRATION_PLAN__SocialPilot_v1.docx
+++ b/BLOG_MIGRATION_PLAN__SocialPilot_v1.docx
@@ -175,7 +175,7 @@
           <w:color w:val="141413"/>
           <w:sz w:val="19"/>
         </w:rPr>
-        <w:t>The 298 removed URLs represent only ~2.6% of retained traffic volume (7.2K vs. 277.8K sessions/12mo). Most are either already-dead legacy aliases or thin, low-traffic posts.</w:t>
+        <w:t>The 298 removed URLs carry only ~8.7K sessions/12mo combined, vs. 277.8K for retained content — a ~3% share. Most are either already-dead legacy aliases or thin, low-traffic posts.</w:t>
       </w:r>
     </w:p>
     <w:p>
@@ -223,7 +223,7 @@
           <w:color w:val="141413"/>
           <w:sz w:val="19"/>
         </w:rPr>
-        <w:t>1,778 internal links currently point at pages being removed and need repointing regardless of the redirect/410 call — see Section 5.</w:t>
+        <w:t>1,814 internal links currently point at pages being removed and need repointing regardless of the redirect/410 call — see Section 5.</w:t>
       </w:r>
     </w:p>
     <w:tbl>
@@ -272,6 +272,7 @@
       <w:r>
         <w:rPr>
           <w:b w:val="0"/>
+          <w:i w:val="0"/>
           <w:color w:val="141413"/>
           <w:sz w:val="19"/>
         </w:rPr>
@@ -815,10 +816,26 @@
       <w:r>
         <w:rPr>
           <w:b w:val="0"/>
+          <w:i w:val="0"/>
           <w:color w:val="141413"/>
           <w:sz w:val="17"/>
         </w:rPr>
         <w:t>Insights = trend/news commentary ("what’s happening"). Strategy = how-to / execution content (including a 13-post Brand &amp; Audience Strategy sub-cluster). Compare = the 5 competitor-pricing pages. /blog retains generic commentary that doesn’t fit the other three.</w:t>
+      </w:r>
+    </w:p>
+    <w:p>
+      <w:pPr>
+        <w:spacing w:before="40" w:after="80"/>
+        <w:jc w:val="left"/>
+      </w:pPr>
+      <w:r>
+        <w:rPr>
+          <w:b w:val="0"/>
+          <w:i/>
+          <w:color w:val="141413"/>
+          <w:sz w:val="17"/>
+        </w:rPr>
+        <w:t>Note: these are the only 4 destinations in this migration — there is no new "/industry" section. Section 4 sends a small number of REMOVED articles (3 of 298) to /industry/* pages that already exist on the site today, unrelated to this restructure, because they happen to be the closest live equivalent for that specific vertical topic.</w:t>
       </w:r>
     </w:p>
     <w:tbl>
@@ -977,6 +994,7 @@
       <w:r>
         <w:rPr>
           <w:b w:val="0"/>
+          <w:i w:val="0"/>
           <w:color w:val="141413"/>
           <w:sz w:val="19"/>
         </w:rPr>
@@ -1434,10 +1452,11 @@
       <w:r>
         <w:rPr>
           <w:b/>
+          <w:i w:val="0"/>
           <w:color w:val="141413"/>
           <w:sz w:val="19"/>
         </w:rPr>
-        <w:t>Combined traffic exposure across all 298 removed URLs: 7,244 sessions/12mo, vs. 277,759 for retained content — a ~2.6% share. This is a low-risk cut.</w:t>
+        <w:t>Combined traffic exposure across all 298 removed URLs: 8,675 sessions/12mo (7,244 from the 180 live pages + 1,431 from the 118 already-redirected aliases), vs. 277,759 for retained content — a ~3% share. This is a low-risk cut.</w:t>
       </w:r>
     </w:p>
     <w:tbl>
@@ -1486,6 +1505,7 @@
       <w:r>
         <w:rPr>
           <w:b w:val="0"/>
+          <w:i w:val="0"/>
           <w:color w:val="141413"/>
           <w:sz w:val="19"/>
         </w:rPr>
@@ -1942,6 +1962,7 @@
       <w:r>
         <w:rPr>
           <w:b/>
+          <w:i w:val="0"/>
           <w:color w:val="141413"/>
           <w:sz w:val="19"/>
         </w:rPr>
@@ -1997,7 +2018,7 @@
                 <w:color w:val="141413"/>
                 <w:sz w:val="19"/>
               </w:rPr>
-              <w:t>•  8 of the 131 redirects point outside the original mapping tab — to /compare, /insights, or /industry/* pages found by auditing the live site. Confirm these hub pages are the intended landing spots, not just an acceptable fallback.</w:t>
+              <w:t>•  8 of the 131 redirects point to real, live pages found outside the original mapping tab: 5 go to the /compare or /insights section hub (still within this migration’s structure), and 3 go to pre-existing /industry/* landing pages (photography, NGO, restaurant marketing agency) that have nothing to do with this restructure — confirm all 8 are the intended landing spots, not just an acceptable fallback.</w:t>
             </w:r>
           </w:p>
           <w:p>
@@ -2009,7 +2030,7 @@
                 <w:color w:val="141413"/>
                 <w:sz w:val="19"/>
               </w:rPr>
-              <w:t>•  1,778 internal links across the site currently point at pages being removed. These need to be found and repointed to the new redirect targets (or removed, for pages going to a 410) — a redirect alone does not fix a stale internal link. See Section 5.</w:t>
+              <w:t>•  1,814 internal links across the site currently point at pages being removed. These need to be found and repointed to the new redirect targets (or removed, for pages going to a 410) — a redirect alone does not fix a stale internal link. See Section 5.</w:t>
             </w:r>
           </w:p>
         </w:tc>
@@ -2108,7 +2129,7 @@
           <w:color w:val="141413"/>
           <w:sz w:val="19"/>
         </w:rPr>
-        <w:t>Audit and repoint the 1,778 internal links currently pointing at removed URLs.</w:t>
+        <w:t>Audit and repoint the 1,814 internal links currently pointing at removed URLs.</w:t>
       </w:r>
     </w:p>
     <w:p>

</xml_diff>

<commit_message>
Exclude /blog/tag/* pages from removal — they are being retained
22 tag archive pages were incorrectly classified as removed. All
/blog/tag/* pages are staying as-is, not being pruned. Removed them
from the redirect plan and recomputed every downstream number in the
main plan doc: retained 231->253, removed 298->276, sessions and
internal-link counts adjusted accordingly.

Superseded BLOG_MIGRATION_removed_url_redirect_map__appendix.xlsx and
BLOG_REDIRECT_PLAN__removed_urls__v1.xlsx (both included the mistaken
tag-page removals) with v2, which covers the correct 276 removed URLs.

Co-Authored-By: Claude Sonnet 5 <noreply@anthropic.com>
Claude-Session: https://claude.ai/code/session_01SGm9DPHLKvwYAnYaGmUjyG
</commit_message>
<xml_diff>
--- a/BLOG_MIGRATION_PLAN__SocialPilot_v1.docx
+++ b/BLOG_MIGRATION_PLAN__SocialPilot_v1.docx
@@ -103,7 +103,7 @@
           <w:color w:val="141413"/>
           <w:sz w:val="19"/>
         </w:rPr>
-        <w:t>529 legacy /blog URLs were audited. 231 articles are being retained, 298 are being removed / pruned.</w:t>
+        <w:t>529 legacy /blog URLs were audited. 253 articles are being retained (including all /blog/tag/* pages — none are being removed), 276 are being removed / pruned.</w:t>
       </w:r>
     </w:p>
     <w:p>
@@ -127,7 +127,7 @@
           <w:color w:val="141413"/>
           <w:sz w:val="19"/>
         </w:rPr>
-        <w:t>Retained content moves into three new top-level sections — /insights, /strategy, /compare — plus a smaller /blog for the handful of posts that don’t fit those buckets.</w:t>
+        <w:t>Retained content moves into three new top-level sections — /insights, /strategy, /compare — plus a smaller /blog for the handful of posts (and all tag pages) that don’t fit those buckets.</w:t>
       </w:r>
     </w:p>
     <w:p>
@@ -151,7 +151,7 @@
           <w:color w:val="141413"/>
           <w:sz w:val="19"/>
         </w:rPr>
-        <w:t>223 articles have a clean, verified, 1-to-1 old → new URL redirect ready to hand to dev. 8 more (blog homepage, top tag pages, 1 glossary post) keep their current URL — no redirect needed.</w:t>
+        <w:t>223 articles have a clean, verified, 1-to-1 old → new URL redirect ready to hand to dev. 30 more (blog homepage, all 28 /blog/tag/* pages, 1 glossary post) keep their current URL — no redirect needed.</w:t>
       </w:r>
     </w:p>
     <w:p>
@@ -175,7 +175,7 @@
           <w:color w:val="141413"/>
           <w:sz w:val="19"/>
         </w:rPr>
-        <w:t>The 298 removed URLs carry only ~8.7K sessions/12mo combined, vs. 277.8K for retained content — a ~3% share. Most are either already-dead legacy aliases or thin, low-traffic posts.</w:t>
+        <w:t>The 276 removed URLs carry only ~8.2K sessions/12mo combined, vs. 278.2K for retained content — a ~3% share. Most are either already-dead legacy aliases or thin, low-traffic posts.</w:t>
       </w:r>
     </w:p>
     <w:p>
@@ -199,7 +199,7 @@
           <w:color w:val="141413"/>
           <w:sz w:val="19"/>
         </w:rPr>
-        <w:t>All 222 removed URLs that lacked a defined disposition now have one: 131 get a redirect to a genuinely relevant, verified-live page elsewhere on socialpilot.co; 91 are confirmed 410s with no suitable equivalent. See Section 4 and the appendix workbook.</w:t>
+        <w:t>All 200 removed URLs that lacked a defined disposition now have one: 113 get a redirect to a genuinely relevant, verified-live page elsewhere on socialpilot.co; 87 are confirmed 410s with no suitable equivalent. See Section 4 and the appendix workbook.</w:t>
       </w:r>
     </w:p>
     <w:p>
@@ -223,7 +223,7 @@
           <w:color w:val="141413"/>
           <w:sz w:val="19"/>
         </w:rPr>
-        <w:t>1,814 internal links currently point at pages being removed and need repointing regardless of the redirect/410 call — see Section 5.</w:t>
+        <w:t>1,794 internal links currently point at pages being removed and need repointing regardless of the redirect/410 call — see Section 5.</w:t>
       </w:r>
     </w:p>
     <w:tbl>
@@ -653,7 +653,7 @@
                 <w:color w:val="141413"/>
                 <w:sz w:val="17"/>
               </w:rPr>
-              <w:t>Stays in /blog</w:t>
+              <w:t>Stays in /blog (incl. all 28 tag pages)</w:t>
             </w:r>
           </w:p>
         </w:tc>
@@ -695,7 +695,7 @@
                 <w:color w:val="141413"/>
                 <w:sz w:val="17"/>
               </w:rPr>
-              <w:t>36</w:t>
+              <w:t>66</w:t>
             </w:r>
           </w:p>
         </w:tc>
@@ -716,7 +716,7 @@
                 <w:color w:val="141413"/>
                 <w:sz w:val="17"/>
               </w:rPr>
-              <w:t>20,606</w:t>
+              <w:t>21,034</w:t>
             </w:r>
           </w:p>
         </w:tc>
@@ -781,7 +781,7 @@
                 <w:color w:val="141413"/>
                 <w:sz w:val="17"/>
               </w:rPr>
-              <w:t>223</w:t>
+              <w:t>253</w:t>
             </w:r>
           </w:p>
         </w:tc>
@@ -802,7 +802,7 @@
                 <w:color w:val="141413"/>
                 <w:sz w:val="17"/>
               </w:rPr>
-              <w:t>277,759</w:t>
+              <w:t>278,187</w:t>
             </w:r>
           </w:p>
         </w:tc>
@@ -820,7 +820,7 @@
           <w:color w:val="141413"/>
           <w:sz w:val="17"/>
         </w:rPr>
-        <w:t>Insights = trend/news commentary ("what’s happening"). Strategy = how-to / execution content (including a 13-post Brand &amp; Audience Strategy sub-cluster). Compare = the 5 competitor-pricing pages. /blog retains generic commentary that doesn’t fit the other three.</w:t>
+        <w:t>Insights = trend/news commentary ("what’s happening"). Strategy = how-to / execution content (including a 13-post Brand &amp; Audience Strategy sub-cluster). Compare = the 5 competitor-pricing pages. /blog retains generic commentary that doesn’t fit the other three, plus every /blog/tag/* archive page — tag pages are being kept, not pruned.</w:t>
       </w:r>
     </w:p>
     <w:p>
@@ -835,7 +835,7 @@
           <w:color w:val="141413"/>
           <w:sz w:val="17"/>
         </w:rPr>
-        <w:t>Note: these are the only 4 destinations in this migration — there is no new "/industry" section. Section 4 sends a small number of REMOVED articles (3 of 298) to /industry/* pages that already exist on the site today, unrelated to this restructure, because they happen to be the closest live equivalent for that specific vertical topic.</w:t>
+        <w:t>Note: these are the only 4 destinations in this migration — there is no new "/industry" section. Section 4 sends a small number of REMOVED articles (3 of 276) to /industry/* pages that already exist on the site today, unrelated to this restructure, because they happen to be the closest live equivalent for that specific vertical topic.</w:t>
       </w:r>
     </w:p>
     <w:tbl>
@@ -921,7 +921,7 @@
           <w:color w:val="141413"/>
           <w:sz w:val="19"/>
         </w:rPr>
-        <w:t>8 retained URLs need no redirect — the /blog homepage, 5 top-level tag pages (instagram, tiktok, twitter, how-tos, social-media-marketing, social-media-engagement), and 1 glossary post stay exactly where they are.</w:t>
+        <w:t>30 retained URLs need no redirect — the /blog homepage, all 28 /blog/tag/* archive pages, and 1 glossary post stay exactly where they are. Tag pages are being kept as-is, not pruned.</w:t>
       </w:r>
     </w:p>
     <w:p>
@@ -998,7 +998,7 @@
           <w:color w:val="141413"/>
           <w:sz w:val="19"/>
         </w:rPr>
-        <w:t>298 legacy URLs are being retired. Breaking that down by what they actually are today:</w:t>
+        <w:t>276 legacy URLs are being retired — note this excludes all /blog/tag/* pages, which are being kept as-is (see Section 2). Breaking the 276 down by what they actually are today:</w:t>
       </w:r>
     </w:p>
     <w:tbl>
@@ -1375,7 +1375,7 @@
                 <w:color w:val="141413"/>
                 <w:sz w:val="16"/>
               </w:rPr>
-              <w:t>Live, standalone thin/low-traffic pages + pruned tag pages</w:t>
+              <w:t>Live, standalone thin/low-traffic pages</w:t>
             </w:r>
           </w:p>
         </w:tc>
@@ -1396,7 +1396,7 @@
                 <w:color w:val="141413"/>
                 <w:sz w:val="16"/>
               </w:rPr>
-              <w:t>180</w:t>
+              <w:t>158</w:t>
             </w:r>
           </w:p>
         </w:tc>
@@ -1417,7 +1417,7 @@
                 <w:color w:val="141413"/>
                 <w:sz w:val="16"/>
               </w:rPr>
-              <w:t>Avg. 40 sessions/yr, max 163; includes ~22 low-value tag pages</w:t>
+              <w:t>Avg. 40 sessions/yr, max 163</w:t>
             </w:r>
           </w:p>
         </w:tc>
@@ -1456,7 +1456,7 @@
           <w:color w:val="141413"/>
           <w:sz w:val="19"/>
         </w:rPr>
-        <w:t>Combined traffic exposure across all 298 removed URLs: 8,675 sessions/12mo (7,244 from the 180 live pages + 1,431 from the 118 already-redirected aliases), vs. 277,759 for retained content — a ~3% share. This is a low-risk cut.</w:t>
+        <w:t>Combined traffic exposure across all 276 removed URLs: 8,247 sessions/12mo, vs. 278,187 for retained content — a ~3% share. This is a low-risk cut.</w:t>
       </w:r>
     </w:p>
     <w:tbl>
@@ -1509,7 +1509,7 @@
           <w:color w:val="141413"/>
           <w:sz w:val="19"/>
         </w:rPr>
-        <w:t>The source sheet only specified a 410 for 6 URLs, leaving 222 removed URLs (the 180 live articles above, plus 42 legacy aliases whose old redirect target is also being cut) with no defined disposition. Each of the 222 was checked against the 223 retained articles’ new URLs AND the live socialpilot.co domain — /features, /industry, /tools, /compare — for a genuinely relevant, real, verified-live destination before deciding.</w:t>
+        <w:t>The source sheet only specified a 410 for 6 URLs, leaving 200 removed URLs (the 158 live articles above, plus 42 legacy aliases whose old redirect target is also being cut) with no defined disposition — /blog/tag/* pages are excluded from this count since they are being retained, not removed. Each of the 200 was checked against the 223 retained articles’ new URLs AND the live socialpilot.co domain — /features, /industry, /tools, /compare — for a genuinely relevant, real, verified-live destination before deciding.</w:t>
       </w:r>
     </w:p>
     <w:tbl>
@@ -1649,7 +1649,7 @@
                 <w:color w:val="141413"/>
                 <w:sz w:val="16"/>
               </w:rPr>
-              <w:t>61</w:t>
+              <w:t>55</w:t>
             </w:r>
           </w:p>
         </w:tc>
@@ -1735,7 +1735,7 @@
                 <w:color w:val="141413"/>
                 <w:sz w:val="16"/>
               </w:rPr>
-              <w:t>70</w:t>
+              <w:t>58</w:t>
             </w:r>
           </w:p>
         </w:tc>
@@ -1821,7 +1821,7 @@
                 <w:color w:val="141413"/>
                 <w:sz w:val="16"/>
               </w:rPr>
-              <w:t>91</w:t>
+              <w:t>87</w:t>
             </w:r>
           </w:p>
         </w:tc>
@@ -1842,7 +1842,7 @@
                 <w:color w:val="141413"/>
                 <w:sz w:val="16"/>
               </w:rPr>
-              <w:t>2,697</w:t>
+              <w:t>2,624</w:t>
             </w:r>
           </w:p>
         </w:tc>
@@ -1907,7 +1907,7 @@
                 <w:color w:val="141413"/>
                 <w:sz w:val="16"/>
               </w:rPr>
-              <w:t>222</w:t>
+              <w:t>200</w:t>
             </w:r>
           </w:p>
         </w:tc>
@@ -1928,7 +1928,7 @@
                 <w:color w:val="141413"/>
                 <w:sz w:val="16"/>
               </w:rPr>
-              <w:t>5,141 (redirects)</w:t>
+              <w:t>4,786 (redirects)</w:t>
             </w:r>
           </w:p>
         </w:tc>
@@ -1966,7 +1966,7 @@
           <w:color w:val="141413"/>
           <w:sz w:val="19"/>
         </w:rPr>
-        <w:t>Full URL-by-URL detail — old URL, action, redirect target, confidence, and rationale — is in the companion workbook: BLOG_MIGRATION_removed_url_redirect_map__appendix.xlsx</w:t>
+        <w:t>Full URL-by-URL detail — old URL, action, redirect target, confidence, and rationale — is in the companion workbook: BLOG_REDIRECT_PLAN__removed_urls__v2.xlsx (covers all 276 removed URLs, including the 76 already-redirected aliases above)</w:t>
       </w:r>
     </w:p>
     <w:tbl>
@@ -2006,7 +2006,7 @@
                 <w:color w:val="141413"/>
                 <w:sz w:val="19"/>
               </w:rPr>
-              <w:t>•  The 70 "medium/low confidence" redirects are judgment calls (e.g. a dentists article folding into a general doctors/healthcare page) — SEO/content lead should spot-check these before they go live.</w:t>
+              <w:t>•  The 58 "medium/low confidence" redirects are judgment calls (e.g. a dentists article folding into a general doctors/healthcare page) — SEO/content lead should spot-check these before they go live.</w:t>
             </w:r>
           </w:p>
           <w:p>
@@ -2018,7 +2018,7 @@
                 <w:color w:val="141413"/>
                 <w:sz w:val="19"/>
               </w:rPr>
-              <w:t>•  8 of the 131 redirects point to real, live pages found outside the original mapping tab: 5 go to the /compare or /insights section hub (still within this migration’s structure), and 3 go to pre-existing /industry/* landing pages (photography, NGO, restaurant marketing agency) that have nothing to do with this restructure — confirm all 8 are the intended landing spots, not just an acceptable fallback.</w:t>
+              <w:t>•  8 of the 113 new redirects point to real, live pages found outside the original mapping tab: 5 go to the /compare or /insights section hub (still within this migration’s structure), and 3 go to pre-existing /industry/* landing pages (photography, NGO, restaurant marketing agency) that have nothing to do with this restructure — confirm all 8 are the intended landing spots, not just an acceptable fallback.</w:t>
             </w:r>
           </w:p>
           <w:p>
@@ -2030,7 +2030,7 @@
                 <w:color w:val="141413"/>
                 <w:sz w:val="19"/>
               </w:rPr>
-              <w:t>•  1,814 internal links across the site currently point at pages being removed. These need to be found and repointed to the new redirect targets (or removed, for pages going to a 410) — a redirect alone does not fix a stale internal link. See Section 5.</w:t>
+              <w:t>•  1,794 internal links across the site currently point at pages being removed. These need to be found and repointed to the new redirect targets (or removed, for pages going to a 410) — a redirect alone does not fix a stale internal link. See Section 5.</w:t>
             </w:r>
           </w:p>
         </w:tc>
@@ -2090,7 +2090,7 @@
           <w:color w:val="141413"/>
           <w:sz w:val="19"/>
         </w:rPr>
-        <w:t>SEO/content lead spot-checks the 70 medium/low-confidence redirects in the appendix workbook (Section 4).</w:t>
+        <w:t>SEO/content lead spot-checks the 58 medium/low-confidence redirects in the appendix workbook (Section 4).</w:t>
       </w:r>
     </w:p>
     <w:p>
@@ -2116,7 +2116,7 @@
           <w:color w:val="141413"/>
           <w:sz w:val="19"/>
         </w:rPr>
-        <w:t>Implement the 131 redirects + 91 410s for removed URLs from the appendix workbook.</w:t>
+        <w:t>Implement the 189 redirects + 87 410s for removed URLs from the appendix workbook — do NOT touch /blog/tag/* pages, they are being kept.</w:t>
       </w:r>
     </w:p>
     <w:p>
@@ -2129,7 +2129,7 @@
           <w:color w:val="141413"/>
           <w:sz w:val="19"/>
         </w:rPr>
-        <w:t>Audit and repoint the 1,814 internal links currently pointing at removed URLs.</w:t>
+        <w:t>Audit and repoint the 1,794 internal links currently pointing at removed URLs.</w:t>
       </w:r>
     </w:p>
     <w:p>
@@ -2142,7 +2142,7 @@
           <w:color w:val="141413"/>
           <w:sz w:val="19"/>
         </w:rPr>
-        <w:t>Update the XML sitemap: add new /insights, /strategy, /compare URLs; remove pruned URLs.</w:t>
+        <w:t>Update the XML sitemap: add new /insights, /strategy, /compare URLs; remove pruned URLs (tag pages stay in the sitemap).</w:t>
       </w:r>
     </w:p>
     <w:p>
@@ -2501,7 +2501,7 @@
           <w:color w:val="141413"/>
           <w:sz w:val="19"/>
         </w:rPr>
-        <w:t>No net loss in organic sessions to migrated content at the 60/90-day mark (baseline: 277,759 sessions/12mo across the 223 retained articles).</w:t>
+        <w:t>No net loss in organic sessions to migrated content at the 60/90-day mark (baseline: 278,187 sessions/12mo across the 253 retained articles).</w:t>
       </w:r>
     </w:p>
     <w:p>

</xml_diff>

<commit_message>
Add cross-sheet data integrity verification to migration plan
Cross-checked the consolidated 3-tab workbook (Complete Blogs List +
URL Mapping + Redirect Plan) the user provided for a final review:
zero duplicates, no overlap between retained/removed URL sets, every
redirect target verified real, no chains/self-redirects/blank targets,
and all 76 already-aliased rows independently re-verified against
source data. All checks passed.

Added a new Section 5 documenting this verification, and flagged the
one non-blocking data-hygiene note found: the source Complete Blogs
List sheet's Status column was never updated to reflect the tag-page
correction (still shows 22 tag pages as "To be Removed" even though
they're retained) — the Redirect Plan and this doc both correctly
override it, but future edits to the source sheet should account for
this.

Co-Authored-By: Claude Sonnet 5 <noreply@anthropic.com>
Claude-Session: https://claude.ai/code/session_01SGm9DPHLKvwYAnYaGmUjyG
</commit_message>
<xml_diff>
--- a/BLOG_MIGRATION_PLAN__SocialPilot_v1.docx
+++ b/BLOG_MIGRATION_PLAN__SocialPilot_v1.docx
@@ -41,7 +41,7 @@
           <w:color w:val="3D3D3A"/>
           <w:sz w:val="18"/>
         </w:rPr>
-        <w:t>Based on: Blog URL Mapping (Final) — Complete Blogs List + URL Mapping tabs</w:t>
+        <w:t>Based on: Blog URL Mapping (Final) — Complete Blogs List + URL Mapping + Redirect Plan tabs, cross-checked</w:t>
       </w:r>
     </w:p>
     <w:tbl>
@@ -223,7 +223,7 @@
           <w:color w:val="141413"/>
           <w:sz w:val="19"/>
         </w:rPr>
-        <w:t>1,794 internal links currently point at pages being removed and need repointing regardless of the redirect/410 call — see Section 5.</w:t>
+        <w:t>1,794 internal links currently point at pages being removed and need repointing regardless of the redirect/410 call — see Section 6.</w:t>
       </w:r>
     </w:p>
     <w:tbl>
@@ -2030,7 +2030,7 @@
                 <w:color w:val="141413"/>
                 <w:sz w:val="19"/>
               </w:rPr>
-              <w:t>•  1,794 internal links across the site currently point at pages being removed. These need to be found and repointed to the new redirect targets (or removed, for pages going to a 410) — a redirect alone does not fix a stale internal link. See Section 5.</w:t>
+              <w:t>•  1,794 internal links across the site currently point at pages being removed. These need to be found and repointed to the new redirect targets (or removed, for pages going to a 410) — a redirect alone does not fix a stale internal link. See Section 6.</w:t>
             </w:r>
           </w:p>
         </w:tc>
@@ -2068,7 +2068,187 @@
                 <w:color w:val="FFFFFF"/>
                 <w:sz w:val="22"/>
               </w:rPr>
-              <w:t>5. EXECUTION CHECKLIST</w:t>
+              <w:t>5. DATA INTEGRITY VERIFICATION</w:t>
+            </w:r>
+          </w:p>
+        </w:tc>
+      </w:tr>
+    </w:tbl>
+    <w:p>
+      <w:pPr>
+        <w:spacing w:before="40" w:after="40"/>
+        <w:jc w:val="left"/>
+      </w:pPr>
+    </w:p>
+    <w:p>
+      <w:pPr>
+        <w:spacing w:before="80" w:after="120"/>
+        <w:jc w:val="left"/>
+      </w:pPr>
+      <w:r>
+        <w:rPr>
+          <w:b w:val="0"/>
+          <w:i w:val="0"/>
+          <w:color w:val="141413"/>
+          <w:sz w:val="19"/>
+        </w:rPr>
+        <w:t>Before finalizing, the three source tabs (Complete Blogs List, URL Mapping, Redirect Plan) were cross-checked programmatically against each other. All checks passed:</w:t>
+      </w:r>
+    </w:p>
+    <w:p>
+      <w:pPr>
+        <w:pStyle w:val="ListBullet"/>
+        <w:spacing w:before="20" w:after="20"/>
+      </w:pPr>
+      <w:r>
+        <w:rPr>
+          <w:color w:val="141413"/>
+          <w:sz w:val="19"/>
+        </w:rPr>
+        <w:t>Zero duplicate URLs across all three tabs.</w:t>
+      </w:r>
+    </w:p>
+    <w:p>
+      <w:pPr>
+        <w:pStyle w:val="ListBullet"/>
+        <w:spacing w:before="20" w:after="20"/>
+      </w:pPr>
+      <w:r>
+        <w:rPr>
+          <w:color w:val="141413"/>
+          <w:sz w:val="19"/>
+        </w:rPr>
+        <w:t>Every URL in URL Mapping (223 rows) is marked "To Be Retained" in Complete Blogs List — and vice versa, every "To Be Retained" URL not in URL Mapping is one of the 30 stay-as-is pages (Section 2).</w:t>
+      </w:r>
+    </w:p>
+    <w:p>
+      <w:pPr>
+        <w:pStyle w:val="ListBullet"/>
+        <w:spacing w:before="20" w:after="20"/>
+      </w:pPr>
+      <w:r>
+        <w:rPr>
+          <w:color w:val="141413"/>
+          <w:sz w:val="19"/>
+        </w:rPr>
+        <w:t>Every URL in Redirect Plan (276 rows) is marked "To be Removed" in Complete Blogs List, with zero overlap against the URL Mapping set.</w:t>
+      </w:r>
+    </w:p>
+    <w:p>
+      <w:pPr>
+        <w:pStyle w:val="ListBullet"/>
+        <w:spacing w:before="20" w:after="20"/>
+      </w:pPr>
+      <w:r>
+        <w:rPr>
+          <w:color w:val="141413"/>
+          <w:sz w:val="19"/>
+        </w:rPr>
+        <w:t>Every redirect target is a verified real URL — either the New URL for a retained article, or one of the 5 live domain pages found outside the mapping tab (Section 4). Zero blank targets, zero self-redirects, and zero redirect chains (no target that is itself another removed URL).</w:t>
+      </w:r>
+    </w:p>
+    <w:p>
+      <w:pPr>
+        <w:pStyle w:val="ListBullet"/>
+        <w:spacing w:before="20" w:after="20"/>
+      </w:pPr>
+      <w:r>
+        <w:rPr>
+          <w:color w:val="141413"/>
+          <w:sz w:val="19"/>
+        </w:rPr>
+        <w:t>All 76 "already-aliased" rows independently re-verified against Complete Blogs List’s redirect-chain data and URL Mapping’s new-URL column — exact match on all 76.</w:t>
+      </w:r>
+    </w:p>
+    <w:p>
+      <w:pPr>
+        <w:pStyle w:val="ListBullet"/>
+        <w:spacing w:before="20" w:after="20"/>
+      </w:pPr>
+      <w:r>
+        <w:rPr>
+          <w:color w:val="141413"/>
+          <w:sz w:val="19"/>
+        </w:rPr>
+        <w:t>223 (URL Mapping) + 276 (Redirect Plan) + 30 (stay-as-is) = 529 — reconciles exactly with the full blog audit.</w:t>
+      </w:r>
+    </w:p>
+    <w:tbl>
+      <w:tblPr>
+        <w:tblStyle w:val="TableGrid"/>
+        <w:tblW w:type="auto" w:w="0"/>
+        <w:tblLook w:firstColumn="1" w:firstRow="1" w:lastColumn="0" w:lastRow="0" w:noHBand="0" w:noVBand="1" w:val="04A0"/>
+      </w:tblPr>
+      <w:tblGrid>
+        <w:gridCol w:w="9936"/>
+      </w:tblGrid>
+      <w:tr>
+        <w:tc>
+          <w:tcPr>
+            <w:tcW w:type="dxa" w:w="9936"/>
+            <w:shd w:val="clear" w:color="auto" w:fill="FDECEC"/>
+          </w:tcPr>
+          <w:p>
+            <w:pPr>
+              <w:spacing w:before="80" w:after="40"/>
+            </w:pPr>
+            <w:r>
+              <w:rPr>
+                <w:b/>
+                <w:color w:val="B42318"/>
+                <w:sz w:val="20"/>
+              </w:rPr>
+              <w:t>One source-data note (not a plan error)</w:t>
+            </w:r>
+          </w:p>
+          <w:p>
+            <w:pPr>
+              <w:spacing w:before="20" w:after="60"/>
+            </w:pPr>
+            <w:r>
+              <w:rPr>
+                <w:color w:val="141413"/>
+                <w:sz w:val="19"/>
+              </w:rPr>
+              <w:t>•  Complete Blogs List’s Status column still shows the 22 corrected tag pages as "To be Removed" — it was never updated after the tag-page correction. The Redirect Plan and this document both correctly treat all 28 tag pages as retained; anyone pulling counts directly from that Status column instead of the Redirect Plan should be aware of this override.</w:t>
+            </w:r>
+          </w:p>
+        </w:tc>
+      </w:tr>
+    </w:tbl>
+    <w:p>
+      <w:pPr>
+        <w:spacing w:before="40" w:after="40"/>
+        <w:jc w:val="left"/>
+      </w:pPr>
+    </w:p>
+    <w:tbl>
+      <w:tblPr>
+        <w:tblStyle w:val="TableGrid"/>
+        <w:tblW w:type="auto" w:w="0"/>
+        <w:tblLook w:firstColumn="1" w:firstRow="1" w:lastColumn="0" w:lastRow="0" w:noHBand="0" w:noVBand="1" w:val="04A0"/>
+      </w:tblPr>
+      <w:tblGrid>
+        <w:gridCol w:w="9936"/>
+      </w:tblGrid>
+      <w:tr>
+        <w:tc>
+          <w:tcPr>
+            <w:tcW w:type="dxa" w:w="9936"/>
+            <w:shd w:val="clear" w:color="auto" w:fill="1A56DB"/>
+          </w:tcPr>
+          <w:p>
+            <w:pPr>
+              <w:spacing w:before="80" w:after="80"/>
+              <w:jc w:val="left"/>
+            </w:pPr>
+            <w:r>
+              <w:rPr>
+                <w:b/>
+                <w:color w:val="FFFFFF"/>
+                <w:sz w:val="22"/>
+              </w:rPr>
+              <w:t>6. EXECUTION CHECKLIST</w:t>
             </w:r>
           </w:p>
         </w:tc>
@@ -2210,7 +2390,7 @@
                 <w:color w:val="FFFFFF"/>
                 <w:sz w:val="22"/>
               </w:rPr>
-              <w:t>6. SUGGESTED TIMELINE</w:t>
+              <w:t>7. SUGGESTED TIMELINE</w:t>
             </w:r>
           </w:p>
         </w:tc>
@@ -2479,7 +2659,7 @@
                 <w:color w:val="FFFFFF"/>
                 <w:sz w:val="22"/>
               </w:rPr>
-              <w:t>7. SUCCESS METRICS</w:t>
+              <w:t>8. SUCCESS METRICS</w:t>
             </w:r>
           </w:p>
         </w:tc>

</xml_diff>

<commit_message>
Cap /blog holdback at 13 for the reclassified articles
Loosened the fit test slightly: articles with more than 8 sessions/12mo
get the benefit of the doubt on a plausible secondary fit rather than
defaulting to /blog, so borderline-but-higher-traffic content (skills
checklists, portfolio/proposal how-tos, "how to become a manager")
moves into /strategy or /insights instead of sitting in legacy /blog.

Result: 17 of 30 move (5 to /insights, 12 to /strategy), down from 8;
13 remain in /blog, down from 22 — all <=8 sessions/12mo and almost
entirely the deepest agency-operations cluster (approval workflows,
team structure, scaling pain points). Updated the reclassified-articles
workbook to v3 and every downstream number in the main plan doc.

Co-Authored-By: Claude Sonnet 5 <noreply@anthropic.com>
Claude-Session: https://claude.ai/code/session_01SGm9DPHLKvwYAnYaGmUjyG
</commit_message>
<xml_diff>
--- a/BLOG_MIGRATION_PLAN__SocialPilot_v1.docx
+++ b/BLOG_MIGRATION_PLAN__SocialPilot_v1.docx
@@ -151,7 +151,7 @@
           <w:color w:val="141413"/>
           <w:sz w:val="19"/>
         </w:rPr>
-        <w:t>231 articles have a clean, verified, 1-to-1 old → new URL redirect ready to hand to dev (223 from the original mapping + 8 newly reclassified). 52 more (blog homepage, all 28 /blog/tag/* pages, 1 glossary post, + 22 reclassified articles that didn’t clearly fit /insights or /strategy) keep their current URL — no redirect needed.</w:t>
+        <w:t>240 articles have a clean, verified, 1-to-1 old → new URL redirect ready to hand to dev (223 from the original mapping + 17 newly reclassified). 43 more (blog homepage, all 28 /blog/tag/* pages, 1 glossary post, + 13 reclassified articles that didn’t clearly fit /insights or /strategy) keep their current URL — no redirect needed.</w:t>
       </w:r>
     </w:p>
     <w:p>
@@ -223,7 +223,7 @@
           <w:color w:val="141413"/>
           <w:sz w:val="19"/>
         </w:rPr>
-        <w:t>Effective today, 30 URLs previously slated for a 410 are being reclassified as retained instead: content that's observational/analytical about the market or platform ("what's happening") goes to /insights, content that's actionable how-to/tactics/planning ("what we should do about it") goes to /strategy — and anything that doesn't clearly fit either stays in /blog rather than being forced into a bucket. Only 8 of the 30 clearly fit; the other 22 hold back in /blog. See Section 1a.</w:t>
+        <w:t>Effective today, 30 URLs previously slated for a 410 are being reclassified as retained instead: content that's observational/analytical about the market or platform ("what's happening") goes to /insights, content that's actionable how-to/tactics/planning ("what we should do about it") goes to /strategy — and anything that doesn't clearly fit either stays in /blog rather than being forced into a bucket, capped at 13 holdbacks. 17 of the 30 clearly (or plausibly) fit; the other 13 — the lowest-traffic, most purely agency-internal-process articles — hold back in /blog. See Section 1a.</w:t>
       </w:r>
     </w:p>
     <w:p>
@@ -461,7 +461,7 @@
                 <w:color w:val="141413"/>
                 <w:sz w:val="17"/>
               </w:rPr>
-              <w:t>64</w:t>
+              <w:t>66</w:t>
             </w:r>
           </w:p>
         </w:tc>
@@ -482,7 +482,7 @@
                 <w:color w:val="141413"/>
                 <w:sz w:val="17"/>
               </w:rPr>
-              <w:t>125,004</w:t>
+              <w:t>125,025</w:t>
             </w:r>
           </w:p>
         </w:tc>
@@ -547,7 +547,7 @@
                 <w:color w:val="141413"/>
                 <w:sz w:val="17"/>
               </w:rPr>
-              <w:t>126</w:t>
+              <w:t>133</w:t>
             </w:r>
           </w:p>
         </w:tc>
@@ -568,7 +568,7 @@
                 <w:color w:val="141413"/>
                 <w:sz w:val="17"/>
               </w:rPr>
-              <w:t>131,114</w:t>
+              <w:t>131,422</w:t>
             </w:r>
           </w:p>
         </w:tc>
@@ -677,7 +677,7 @@
                 <w:color w:val="141413"/>
                 <w:sz w:val="17"/>
               </w:rPr>
-              <w:t>Stays in /blog (incl. all 28 tag pages + 22 reclassified holdbacks)</w:t>
+              <w:t>Stays in /blog (incl. all 28 tag pages + 13 reclassified holdbacks)</w:t>
             </w:r>
           </w:p>
         </w:tc>
@@ -719,7 +719,7 @@
                 <w:color w:val="141413"/>
                 <w:sz w:val="17"/>
               </w:rPr>
-              <w:t>88</w:t>
+              <w:t>79</w:t>
             </w:r>
           </w:p>
         </w:tc>
@@ -740,7 +740,7 @@
                 <w:color w:val="141413"/>
                 <w:sz w:val="17"/>
               </w:rPr>
-              <w:t>21,422</w:t>
+              <w:t>21,093</w:t>
             </w:r>
           </w:p>
         </w:tc>
@@ -912,7 +912,7 @@
           <w:color w:val="141413"/>
           <w:sz w:val="19"/>
         </w:rPr>
-        <w:t>Effective today: content goes to /insights if it's observational/analytical about the market or platform ("what's happening" — data, trends, algorithms, stats). Content goes to /strategy if it's actionable — how-to guides, tactics, planning ("what we should do about it"). Anything that doesn't clearly fall under one of those two holds back in /blog rather than being forced into a bucket. 30 articles previously marked for a 410 were re-reviewed against this rule and are all being retained — but only 8 clearly fit /insights or /strategy. Full list with rationale for every one of the 30: BLOG_RECLASSIFIED_TO_INSIGHTS_STRATEGY__v2.xlsx.</w:t>
+        <w:t>Effective today: content goes to /insights if it's observational/analytical about the market or platform ("what's happening" — data, trends, algorithms, stats). Content goes to /strategy if it's actionable — how-to guides, tactics, planning ("what we should do about it"). Anything that doesn't clearly fall under one of those two holds back in /blog rather than being forced into a bucket — capped at 13 holdbacks, so borderline cases get the benefit of the doubt before landing in /blog. 30 articles previously marked for a 410 were re-reviewed against this rule and are all being retained. Full list with rationale for every one of the 30: BLOG_RECLASSIFIED_TO_INSIGHTS_STRATEGY__v3.xlsx.</w:t>
       </w:r>
     </w:p>
     <w:tbl>
@@ -1031,7 +1031,7 @@
                 <w:color w:val="141413"/>
                 <w:sz w:val="16"/>
               </w:rPr>
-              <w:t>/insights (clear fit)</w:t>
+              <w:t>/insights</w:t>
             </w:r>
           </w:p>
         </w:tc>
@@ -1052,7 +1052,7 @@
                 <w:color w:val="141413"/>
                 <w:sz w:val="16"/>
               </w:rPr>
-              <w:t>3</w:t>
+              <w:t>5</w:t>
             </w:r>
           </w:p>
         </w:tc>
@@ -1073,7 +1073,7 @@
                 <w:color w:val="141413"/>
                 <w:sz w:val="16"/>
               </w:rPr>
-              <w:t>139</w:t>
+              <w:t>160</w:t>
             </w:r>
           </w:p>
         </w:tc>
@@ -1117,7 +1117,7 @@
                 <w:color w:val="141413"/>
                 <w:sz w:val="16"/>
               </w:rPr>
-              <w:t>/strategy (clear fit)</w:t>
+              <w:t>/strategy</w:t>
             </w:r>
           </w:p>
         </w:tc>
@@ -1138,7 +1138,7 @@
                 <w:color w:val="141413"/>
                 <w:sz w:val="16"/>
               </w:rPr>
-              <w:t>5</w:t>
+              <w:t>12</w:t>
             </w:r>
           </w:p>
         </w:tc>
@@ -1159,7 +1159,7 @@
                 <w:color w:val="141413"/>
                 <w:sz w:val="16"/>
               </w:rPr>
-              <w:t>227</w:t>
+              <w:t>535</w:t>
             </w:r>
           </w:p>
         </w:tc>
@@ -1224,7 +1224,7 @@
                 <w:color w:val="141413"/>
                 <w:sz w:val="16"/>
               </w:rPr>
-              <w:t>22</w:t>
+              <w:t>13</w:t>
             </w:r>
           </w:p>
         </w:tc>
@@ -1245,7 +1245,7 @@
                 <w:color w:val="141413"/>
                 <w:sz w:val="16"/>
               </w:rPr>
-              <w:t>388</w:t>
+              <w:t>59</w:t>
             </w:r>
           </w:p>
         </w:tc>
@@ -1266,7 +1266,7 @@
                 <w:color w:val="141413"/>
                 <w:sz w:val="16"/>
               </w:rPr>
-              <w:t>why-your-4th-team-member-kills-agency-profit-margins (agency business operations, not social-platform/market data or a marketing execution tactic)</w:t>
+              <w:t>scale-social-media-approval-process (agency business operations, not social-platform/market data or a marketing execution tactic)</w:t>
             </w:r>
           </w:p>
         </w:tc>
@@ -1369,7 +1369,7 @@
           <w:color w:val="141413"/>
           <w:sz w:val="17"/>
         </w:rPr>
-        <w:t>Most of the 22 held back are the "agency operations" cluster — client approval workflows, team structure, profit margins, agency scaling pain points. That content is about running an agency's internal business, not about the social media market/platform (/insights) or social-media-marketing execution tactics (/strategy), so it stays in /blog rather than being stretched to fit. The 8 that do move keep their existing slug — only the path prefix changes (e.g. /blog/instagram-shadow-banned → /insights/instagram-shadow-banned), the same pattern as every other redirect in this migration.</w:t>
+        <w:t>The cutoff: articles with more than 8 sessions/12mo got the benefit of the doubt on a plausible secondary fit (e.g. social-media-manager-skills reads as a checklist for hiring/skill-building, so it moved to /strategy). The 13 held back are all &lt;=8 sessions/12mo and almost entirely the "agency operations" cluster — client approval workflows, team structure, agency scaling pain points. That content is about running an agency's internal business, not the social media market/platform (/insights) or social-media-marketing execution tactics (/strategy), so it stays in /blog rather than being stretched to fit. The 17 that do move keep their existing slug — only the path prefix changes (e.g. /blog/instagram-shadow-banned → /insights/instagram-shadow-banned), the same pattern as every other redirect in this migration.</w:t>
       </w:r>
     </w:p>
     <w:tbl>
@@ -1431,7 +1431,7 @@
           <w:color w:val="141413"/>
           <w:sz w:val="19"/>
         </w:rPr>
-        <w:t>The URL Mapping tab has a full, verified old → new mapping for all 223 articles: no duplicate destinations, no duplicate sources, one hop each. Add the 8 clearly-reclassified articles (Section 1a) on top of this — same pattern, new destination — for 231 total.</w:t>
+        <w:t>The URL Mapping tab has a full, verified old → new mapping for all 223 articles: no duplicate destinations, no duplicate sources, one hop each. Add the 17 reclassified articles (Section 1a) on top of this — same pattern, new destination — for 240 total.</w:t>
       </w:r>
     </w:p>
     <w:p>
@@ -1455,7 +1455,7 @@
           <w:color w:val="141413"/>
           <w:sz w:val="19"/>
         </w:rPr>
-        <w:t>52 retained URLs need no redirect — the /blog homepage, all 28 /blog/tag/* archive pages, 1 glossary post, and the 22 reclassified articles that didn’t clearly fit /insights or /strategy (Section 1a) all stay exactly where they are.</w:t>
+        <w:t>43 retained URLs need no redirect — the /blog homepage, all 28 /blog/tag/* archive pages, 1 glossary post, and the 13 reclassified articles that didn’t clearly fit /insights or /strategy (Section 1a) all stay exactly where they are.</w:t>
       </w:r>
     </w:p>
     <w:p>
@@ -1532,7 +1532,7 @@
           <w:color w:val="141413"/>
           <w:sz w:val="19"/>
         </w:rPr>
-        <w:t>246 legacy URLs are being retired — this excludes all /blog/tag/* pages (kept as-is, Section 2) and the 30 articles reclassified out of removal (Section 1a: 8 into /insights or /strategy, 22 held back in /blog). Breaking the 246 down by what they actually are today:</w:t>
+        <w:t>246 legacy URLs are being retired — this excludes all /blog/tag/* pages (kept as-is, Section 2) and the 30 articles reclassified out of removal (Section 1a: 17 into /insights or /strategy, 13 held back in /blog). Breaking the 246 down by what they actually are today:</w:t>
       </w:r>
     </w:p>
     <w:tbl>
@@ -2564,7 +2564,7 @@
                 <w:color w:val="141413"/>
                 <w:sz w:val="19"/>
               </w:rPr>
-              <w:t>•  The 30 articles re-reviewed in Section 1a involved judgment calls too — both which 8 clearly fit /insights or /strategy, and which 22 didn't (e.g. "10 mistakes to avoid" reads as either analytical or actionable, which is why it held back) — worth a quick pass by whoever owns the /insights-vs-/strategy split to confirm before launch.</w:t>
+              <w:t>•  The 30 articles re-reviewed in Section 1a involved judgment calls too — both which 17 fit /insights or /strategy (some only plausibly, not clearly), and which 13 didn't (e.g. "10 mistakes to avoid" reads as either analytical or actionable, which is why it held back) — worth a quick pass by whoever owns the /insights-vs-/strategy split to confirm before launch.</w:t>
             </w:r>
           </w:p>
           <w:p>
@@ -2729,7 +2729,7 @@
           <w:color w:val="141413"/>
           <w:sz w:val="19"/>
         </w:rPr>
-        <w:t>Since then, the 30 re-reviewed articles (Section 1a) were pulled out of Redirect Plan and independently checked: all 30 confirmed present exactly once in Complete Blogs List, zero duplicates against each other or against the URL Mapping / Redirect Plan sets, and the 8 that get a new URL follow the same slug-preserving pattern as the rest of the migration. 231 (URL Mapping + 8 reclassified) + 246 (Redirect Plan) + 52 (stay-as-is, incl. the 22 held back in /blog) = 529 — still reconciles.</w:t>
+        <w:t>Since then, the 30 re-reviewed articles (Section 1a) were pulled out of Redirect Plan and independently checked: all 30 confirmed present exactly once in Complete Blogs List, zero duplicates against each other or against the URL Mapping / Redirect Plan sets, and the 17 that get a new URL follow the same slug-preserving pattern as the rest of the migration. 240 (URL Mapping + 17 reclassified) + 246 (Redirect Plan) + 43 (stay-as-is, incl. the 13 held back in /blog) = 529 — still reconciles.</w:t>
       </w:r>
     </w:p>
     <w:tbl>
@@ -2842,7 +2842,7 @@
           <w:color w:val="141413"/>
           <w:sz w:val="19"/>
         </w:rPr>
-        <w:t>Implement all 223 verified 301 redirects from the URL Mapping tab, plus the 8 from the reclassified-articles workbook (231 total retained-article redirects).</w:t>
+        <w:t>Implement all 223 verified 301 redirects from the URL Mapping tab, plus the 17 from the reclassified-articles workbook (240 total retained-article redirects).</w:t>
       </w:r>
     </w:p>
     <w:p>
@@ -2855,7 +2855,7 @@
           <w:color w:val="141413"/>
           <w:sz w:val="19"/>
         </w:rPr>
-        <w:t>Implement the 189 redirects + 57 410s for removed URLs from the redirect-plan workbook — do NOT touch /blog/tag/* pages or the 22 reclassified articles held back in /blog, they are being kept as-is.</w:t>
+        <w:t>Implement the 189 redirects + 57 410s for removed URLs from the redirect-plan workbook — do NOT touch /blog/tag/* pages or the 13 reclassified articles held back in /blog, they are being kept as-is.</w:t>
       </w:r>
     </w:p>
     <w:p>
@@ -3266,7 +3266,7 @@
           <w:color w:val="141413"/>
           <w:sz w:val="19"/>
         </w:rPr>
-        <w:t>All 231 retained-article redirects resolve in a single hop — no chains.</w:t>
+        <w:t>All 240 retained-article redirects resolve in a single hop — no chains.</w:t>
       </w:r>
     </w:p>
     <w:p>

</xml_diff>